<commit_message>
Daly standup frissitese 2026.04.15
</commit_message>
<xml_diff>
--- a/dokumentumok/Daly_stand-up.docx
+++ b/dokumentumok/Daly_stand-up.docx
@@ -538,26 +538,259 @@
         </w:rPr>
         <w:t>mükődtetése</w:t>
       </w:r>
+      <w:proofErr w:type="spellEnd"/>
+    </w:p>
+    <w:p>
+      <w:pPr>
+        <w:ind w:left="708"/>
+        <w:rPr>
+          <w:sz w:val="24"/>
+          <w:szCs w:val="24"/>
+          <w:u w:val="single"/>
+        </w:rPr>
+      </w:pPr>
+      <w:r>
+        <w:rPr>
+          <w:sz w:val="24"/>
+          <w:szCs w:val="24"/>
+          <w:u w:val="single"/>
+        </w:rPr>
+        <w:t>Kristóf:</w:t>
+      </w:r>
+    </w:p>
+    <w:p>
+      <w:pPr>
+        <w:ind w:left="708"/>
+        <w:rPr>
+          <w:sz w:val="24"/>
+          <w:szCs w:val="24"/>
+        </w:rPr>
+      </w:pPr>
+      <w:r>
+        <w:rPr>
+          <w:sz w:val="24"/>
+          <w:szCs w:val="24"/>
+        </w:rPr>
+        <w:tab/>
+        <w:t>-</w:t>
+      </w:r>
+      <w:proofErr w:type="spellStart"/>
+      <w:r>
+        <w:rPr>
+          <w:sz w:val="24"/>
+          <w:szCs w:val="24"/>
+        </w:rPr>
+        <w:t>Api</w:t>
+      </w:r>
+      <w:proofErr w:type="spellEnd"/>
+      <w:r>
+        <w:rPr>
+          <w:sz w:val="24"/>
+          <w:szCs w:val="24"/>
+        </w:rPr>
+        <w:t xml:space="preserve"> hívások megírása</w:t>
+      </w:r>
+    </w:p>
+    <w:p>
+      <w:pPr>
+        <w:ind w:left="708"/>
+        <w:rPr>
+          <w:sz w:val="24"/>
+          <w:szCs w:val="24"/>
+        </w:rPr>
+      </w:pPr>
+      <w:r>
+        <w:rPr>
+          <w:sz w:val="24"/>
+          <w:szCs w:val="24"/>
+        </w:rPr>
+        <w:tab/>
+        <w:t xml:space="preserve">-Termékek konzolra </w:t>
+      </w:r>
+      <w:proofErr w:type="gramStart"/>
+      <w:r>
+        <w:rPr>
+          <w:sz w:val="24"/>
+          <w:szCs w:val="24"/>
+        </w:rPr>
+        <w:t>írása</w:t>
+      </w:r>
+      <w:proofErr w:type="gramEnd"/>
+      <w:r>
+        <w:rPr>
+          <w:sz w:val="24"/>
+          <w:szCs w:val="24"/>
+        </w:rPr>
+        <w:t xml:space="preserve"> azaz teszt</w:t>
+      </w:r>
+      <w:r>
+        <w:rPr>
+          <w:sz w:val="24"/>
+          <w:szCs w:val="24"/>
+        </w:rPr>
+        <w:tab/>
+      </w:r>
+    </w:p>
+    <w:p>
+      <w:pPr>
+        <w:ind w:left="708"/>
+        <w:rPr>
+          <w:sz w:val="24"/>
+          <w:szCs w:val="24"/>
+        </w:rPr>
+      </w:pPr>
+      <w:r>
+        <w:rPr>
+          <w:sz w:val="24"/>
+          <w:szCs w:val="24"/>
+        </w:rPr>
+        <w:tab/>
+      </w:r>
+    </w:p>
+    <w:p>
+      <w:pPr>
+        <w:ind w:left="708"/>
+        <w:rPr>
+          <w:sz w:val="24"/>
+          <w:szCs w:val="24"/>
+        </w:rPr>
+      </w:pPr>
+    </w:p>
+    <w:p>
+      <w:pPr>
+        <w:ind w:left="708"/>
+        <w:rPr>
+          <w:sz w:val="24"/>
+          <w:szCs w:val="24"/>
+        </w:rPr>
+      </w:pPr>
+    </w:p>
+    <w:p>
+      <w:pPr>
+        <w:ind w:left="708"/>
+        <w:rPr>
+          <w:sz w:val="24"/>
+          <w:szCs w:val="24"/>
+        </w:rPr>
+      </w:pPr>
+    </w:p>
+    <w:p>
+      <w:pPr>
+        <w:ind w:left="708"/>
+        <w:rPr>
+          <w:sz w:val="24"/>
+          <w:szCs w:val="24"/>
+        </w:rPr>
+      </w:pPr>
+    </w:p>
+    <w:p>
+      <w:pPr>
+        <w:ind w:left="708"/>
+        <w:rPr>
+          <w:sz w:val="24"/>
+          <w:szCs w:val="24"/>
+        </w:rPr>
+      </w:pPr>
       <w:bookmarkStart w:id="0" w:name="_GoBack"/>
       <w:bookmarkEnd w:id="0"/>
-      <w:proofErr w:type="spellEnd"/>
-    </w:p>
-    <w:p>
-      <w:pPr>
-        <w:ind w:left="708"/>
+    </w:p>
+    <w:p>
+      <w:pPr>
+        <w:rPr>
+          <w:sz w:val="24"/>
+          <w:szCs w:val="24"/>
+        </w:rPr>
+      </w:pPr>
+      <w:r>
+        <w:rPr>
+          <w:sz w:val="24"/>
+          <w:szCs w:val="24"/>
+        </w:rPr>
+        <w:lastRenderedPageBreak/>
+        <w:t>2026.04.14</w:t>
+      </w:r>
+      <w:r>
+        <w:rPr>
+          <w:sz w:val="24"/>
+          <w:szCs w:val="24"/>
+        </w:rPr>
+        <w:tab/>
+      </w:r>
+    </w:p>
+    <w:p>
+      <w:pPr>
+        <w:rPr>
+          <w:b/>
+          <w:sz w:val="24"/>
+          <w:szCs w:val="24"/>
+        </w:rPr>
+      </w:pPr>
+      <w:r>
+        <w:rPr>
+          <w:b/>
+          <w:sz w:val="24"/>
+          <w:szCs w:val="24"/>
+        </w:rPr>
+        <w:t>Feladatok:</w:t>
+      </w:r>
+    </w:p>
+    <w:p>
+      <w:pPr>
+        <w:ind w:firstLine="708"/>
+        <w:rPr>
+          <w:sz w:val="24"/>
+          <w:szCs w:val="24"/>
+        </w:rPr>
+      </w:pPr>
+      <w:r>
         <w:rPr>
           <w:sz w:val="24"/>
           <w:szCs w:val="24"/>
           <w:u w:val="single"/>
         </w:rPr>
-      </w:pPr>
-      <w:r>
+        <w:t>Hanna</w:t>
+      </w:r>
+      <w:r>
+        <w:rPr>
+          <w:sz w:val="24"/>
+          <w:szCs w:val="24"/>
+        </w:rPr>
+        <w:t>:</w:t>
+      </w:r>
+    </w:p>
+    <w:p>
+      <w:pPr>
+        <w:ind w:firstLine="708"/>
+        <w:rPr>
+          <w:sz w:val="24"/>
+          <w:szCs w:val="24"/>
+        </w:rPr>
+      </w:pPr>
+      <w:r>
+        <w:rPr>
+          <w:sz w:val="24"/>
+          <w:szCs w:val="24"/>
+        </w:rPr>
+        <w:tab/>
+        <w:t>-Termékek módosítása</w:t>
+      </w:r>
+    </w:p>
+    <w:p>
+      <w:pPr>
+        <w:ind w:left="708"/>
         <w:rPr>
           <w:sz w:val="24"/>
           <w:szCs w:val="24"/>
           <w:u w:val="single"/>
         </w:rPr>
-        <w:t>Kristóf:</w:t>
+      </w:pPr>
+      <w:r>
+        <w:rPr>
+          <w:sz w:val="24"/>
+          <w:szCs w:val="24"/>
+          <w:u w:val="single"/>
+        </w:rPr>
+        <w:t xml:space="preserve">Balázs: </w:t>
       </w:r>
     </w:p>
     <w:p>
@@ -582,7 +815,7 @@
           <w:sz w:val="24"/>
           <w:szCs w:val="24"/>
         </w:rPr>
-        <w:t>Api</w:t>
+        <w:t>Ai</w:t>
       </w:r>
       <w:proofErr w:type="spellEnd"/>
       <w:r>
@@ -590,8 +823,17 @@
           <w:sz w:val="24"/>
           <w:szCs w:val="24"/>
         </w:rPr>
-        <w:t xml:space="preserve"> hívások megírása</w:t>
-      </w:r>
+        <w:t xml:space="preserve"> napló </w:t>
+      </w:r>
+      <w:proofErr w:type="spellStart"/>
+      <w:r>
+        <w:rPr>
+          <w:sz w:val="24"/>
+          <w:szCs w:val="24"/>
+        </w:rPr>
+        <w:t>frissíte</w:t>
+      </w:r>
+      <w:proofErr w:type="spellEnd"/>
     </w:p>
     <w:p>
       <w:pPr>
@@ -607,40 +849,143 @@
           <w:szCs w:val="24"/>
         </w:rPr>
         <w:tab/>
-        <w:t xml:space="preserve">-Termékek konzolra </w:t>
-      </w:r>
-      <w:proofErr w:type="gramStart"/>
-      <w:r>
-        <w:rPr>
-          <w:sz w:val="24"/>
-          <w:szCs w:val="24"/>
-        </w:rPr>
-        <w:t>írása</w:t>
-      </w:r>
-      <w:proofErr w:type="gramEnd"/>
-      <w:r>
-        <w:rPr>
-          <w:sz w:val="24"/>
-          <w:szCs w:val="24"/>
-        </w:rPr>
-        <w:t xml:space="preserve"> azaz teszt</w:t>
-      </w:r>
+        <w:t>-</w:t>
+      </w:r>
+      <w:proofErr w:type="spellStart"/>
+      <w:r>
+        <w:rPr>
+          <w:sz w:val="24"/>
+          <w:szCs w:val="24"/>
+        </w:rPr>
+        <w:t>Daly</w:t>
+      </w:r>
+      <w:proofErr w:type="spellEnd"/>
+      <w:r>
+        <w:rPr>
+          <w:sz w:val="24"/>
+          <w:szCs w:val="24"/>
+        </w:rPr>
+        <w:t xml:space="preserve"> stand </w:t>
+      </w:r>
+      <w:proofErr w:type="spellStart"/>
+      <w:r>
+        <w:rPr>
+          <w:sz w:val="24"/>
+          <w:szCs w:val="24"/>
+        </w:rPr>
+        <w:t>up</w:t>
+      </w:r>
+      <w:proofErr w:type="spellEnd"/>
+      <w:r>
+        <w:rPr>
+          <w:sz w:val="24"/>
+          <w:szCs w:val="24"/>
+        </w:rPr>
+        <w:t xml:space="preserve"> vezetése</w:t>
+      </w:r>
+    </w:p>
+    <w:p>
+      <w:pPr>
+        <w:ind w:left="708"/>
+        <w:rPr>
+          <w:sz w:val="24"/>
+          <w:szCs w:val="24"/>
+        </w:rPr>
+      </w:pPr>
       <w:r>
         <w:rPr>
           <w:sz w:val="24"/>
           <w:szCs w:val="24"/>
         </w:rPr>
         <w:tab/>
-      </w:r>
-    </w:p>
-    <w:p>
-      <w:pPr>
-        <w:ind w:left="708"/>
-        <w:rPr>
-          <w:sz w:val="24"/>
-          <w:szCs w:val="24"/>
-        </w:rPr>
-      </w:pPr>
+        <w:t>-Termékek hozzáadás</w:t>
+      </w:r>
+    </w:p>
+    <w:p>
+      <w:pPr>
+        <w:ind w:left="708"/>
+        <w:rPr>
+          <w:sz w:val="24"/>
+          <w:szCs w:val="24"/>
+        </w:rPr>
+      </w:pPr>
+      <w:r>
+        <w:rPr>
+          <w:sz w:val="24"/>
+          <w:szCs w:val="24"/>
+        </w:rPr>
+        <w:tab/>
+        <w:t>-Kódok ellenőrzése</w:t>
+      </w:r>
+    </w:p>
+    <w:p>
+      <w:pPr>
+        <w:ind w:left="708"/>
+        <w:rPr>
+          <w:sz w:val="24"/>
+          <w:szCs w:val="24"/>
+          <w:u w:val="single"/>
+        </w:rPr>
+      </w:pPr>
+      <w:r>
+        <w:rPr>
+          <w:sz w:val="24"/>
+          <w:szCs w:val="24"/>
+          <w:u w:val="single"/>
+        </w:rPr>
+        <w:t>Kristóf:</w:t>
+      </w:r>
+    </w:p>
+    <w:p>
+      <w:pPr>
+        <w:ind w:left="708"/>
+        <w:rPr>
+          <w:sz w:val="24"/>
+          <w:szCs w:val="24"/>
+        </w:rPr>
+      </w:pPr>
+      <w:r>
+        <w:rPr>
+          <w:sz w:val="24"/>
+          <w:szCs w:val="24"/>
+        </w:rPr>
+        <w:tab/>
+        <w:t>- Kosár valuta átváltás</w:t>
+      </w:r>
+    </w:p>
+    <w:p>
+      <w:pPr>
+        <w:ind w:left="708"/>
+        <w:rPr>
+          <w:sz w:val="24"/>
+          <w:szCs w:val="24"/>
+        </w:rPr>
+      </w:pPr>
+      <w:r>
+        <w:rPr>
+          <w:sz w:val="24"/>
+          <w:szCs w:val="24"/>
+        </w:rPr>
+        <w:tab/>
+        <w:t>- Termék konzolra írása</w:t>
+      </w:r>
+    </w:p>
+    <w:p>
+      <w:pPr>
+        <w:ind w:left="708"/>
+        <w:rPr>
+          <w:sz w:val="24"/>
+          <w:szCs w:val="24"/>
+        </w:rPr>
+      </w:pPr>
+      <w:r>
+        <w:rPr>
+          <w:sz w:val="24"/>
+          <w:szCs w:val="24"/>
+        </w:rPr>
+        <w:tab/>
+        <w:t>- Kommentek frissítése</w:t>
+      </w:r>
       <w:r>
         <w:rPr>
           <w:sz w:val="24"/>

</xml_diff>

<commit_message>
Kész a daly standup
</commit_message>
<xml_diff>
--- a/dokumentumok/Daly_stand-up.docx
+++ b/dokumentumok/Daly_stand-up.docx
@@ -691,47 +691,382 @@
           <w:szCs w:val="24"/>
         </w:rPr>
       </w:pPr>
+    </w:p>
+    <w:p>
+      <w:pPr>
+        <w:rPr>
+          <w:sz w:val="24"/>
+          <w:szCs w:val="24"/>
+        </w:rPr>
+      </w:pPr>
+      <w:r>
+        <w:rPr>
+          <w:sz w:val="24"/>
+          <w:szCs w:val="24"/>
+        </w:rPr>
+        <w:lastRenderedPageBreak/>
+        <w:t>2026.04.14</w:t>
+      </w:r>
+      <w:r>
+        <w:rPr>
+          <w:sz w:val="24"/>
+          <w:szCs w:val="24"/>
+        </w:rPr>
+        <w:tab/>
+      </w:r>
+    </w:p>
+    <w:p>
+      <w:pPr>
+        <w:rPr>
+          <w:b/>
+          <w:sz w:val="24"/>
+          <w:szCs w:val="24"/>
+        </w:rPr>
+      </w:pPr>
+      <w:r>
+        <w:rPr>
+          <w:b/>
+          <w:sz w:val="24"/>
+          <w:szCs w:val="24"/>
+        </w:rPr>
+        <w:t>Feladatok:</w:t>
+      </w:r>
+    </w:p>
+    <w:p>
+      <w:pPr>
+        <w:ind w:firstLine="708"/>
+        <w:rPr>
+          <w:sz w:val="24"/>
+          <w:szCs w:val="24"/>
+        </w:rPr>
+      </w:pPr>
+      <w:r>
+        <w:rPr>
+          <w:sz w:val="24"/>
+          <w:szCs w:val="24"/>
+          <w:u w:val="single"/>
+        </w:rPr>
+        <w:t>Hanna</w:t>
+      </w:r>
+      <w:r>
+        <w:rPr>
+          <w:sz w:val="24"/>
+          <w:szCs w:val="24"/>
+        </w:rPr>
+        <w:t>:</w:t>
+      </w:r>
+    </w:p>
+    <w:p>
+      <w:pPr>
+        <w:ind w:firstLine="708"/>
+        <w:rPr>
+          <w:sz w:val="24"/>
+          <w:szCs w:val="24"/>
+        </w:rPr>
+      </w:pPr>
+      <w:r>
+        <w:rPr>
+          <w:sz w:val="24"/>
+          <w:szCs w:val="24"/>
+        </w:rPr>
+        <w:tab/>
+        <w:t>-Termékek módosítása</w:t>
+      </w:r>
+    </w:p>
+    <w:p>
+      <w:pPr>
+        <w:ind w:left="708"/>
+        <w:rPr>
+          <w:sz w:val="24"/>
+          <w:szCs w:val="24"/>
+          <w:u w:val="single"/>
+        </w:rPr>
+      </w:pPr>
+      <w:r>
+        <w:rPr>
+          <w:sz w:val="24"/>
+          <w:szCs w:val="24"/>
+          <w:u w:val="single"/>
+        </w:rPr>
+        <w:t xml:space="preserve">Balázs: </w:t>
+      </w:r>
+    </w:p>
+    <w:p>
+      <w:pPr>
+        <w:ind w:left="708"/>
+        <w:rPr>
+          <w:sz w:val="24"/>
+          <w:szCs w:val="24"/>
+        </w:rPr>
+      </w:pPr>
+      <w:r>
+        <w:rPr>
+          <w:sz w:val="24"/>
+          <w:szCs w:val="24"/>
+        </w:rPr>
+        <w:tab/>
+        <w:t>-</w:t>
+      </w:r>
+      <w:proofErr w:type="spellStart"/>
+      <w:r>
+        <w:rPr>
+          <w:sz w:val="24"/>
+          <w:szCs w:val="24"/>
+        </w:rPr>
+        <w:t>Ai</w:t>
+      </w:r>
+      <w:proofErr w:type="spellEnd"/>
+      <w:r>
+        <w:rPr>
+          <w:sz w:val="24"/>
+          <w:szCs w:val="24"/>
+        </w:rPr>
+        <w:t xml:space="preserve"> napló </w:t>
+      </w:r>
+      <w:proofErr w:type="spellStart"/>
+      <w:r>
+        <w:rPr>
+          <w:sz w:val="24"/>
+          <w:szCs w:val="24"/>
+        </w:rPr>
+        <w:t>frissíte</w:t>
+      </w:r>
+      <w:proofErr w:type="spellEnd"/>
+    </w:p>
+    <w:p>
+      <w:pPr>
+        <w:ind w:left="708"/>
+        <w:rPr>
+          <w:sz w:val="24"/>
+          <w:szCs w:val="24"/>
+        </w:rPr>
+      </w:pPr>
+      <w:r>
+        <w:rPr>
+          <w:sz w:val="24"/>
+          <w:szCs w:val="24"/>
+        </w:rPr>
+        <w:tab/>
+        <w:t>-</w:t>
+      </w:r>
+      <w:proofErr w:type="spellStart"/>
+      <w:r>
+        <w:rPr>
+          <w:sz w:val="24"/>
+          <w:szCs w:val="24"/>
+        </w:rPr>
+        <w:t>Daly</w:t>
+      </w:r>
+      <w:proofErr w:type="spellEnd"/>
+      <w:r>
+        <w:rPr>
+          <w:sz w:val="24"/>
+          <w:szCs w:val="24"/>
+        </w:rPr>
+        <w:t xml:space="preserve"> stand </w:t>
+      </w:r>
+      <w:proofErr w:type="spellStart"/>
+      <w:r>
+        <w:rPr>
+          <w:sz w:val="24"/>
+          <w:szCs w:val="24"/>
+        </w:rPr>
+        <w:t>up</w:t>
+      </w:r>
+      <w:proofErr w:type="spellEnd"/>
+      <w:r>
+        <w:rPr>
+          <w:sz w:val="24"/>
+          <w:szCs w:val="24"/>
+        </w:rPr>
+        <w:t xml:space="preserve"> vezetése</w:t>
+      </w:r>
+    </w:p>
+    <w:p>
+      <w:pPr>
+        <w:ind w:left="708"/>
+        <w:rPr>
+          <w:sz w:val="24"/>
+          <w:szCs w:val="24"/>
+        </w:rPr>
+      </w:pPr>
+      <w:r>
+        <w:rPr>
+          <w:sz w:val="24"/>
+          <w:szCs w:val="24"/>
+        </w:rPr>
+        <w:tab/>
+        <w:t>-Kódok ellenőrzése</w:t>
+      </w:r>
+    </w:p>
+    <w:p>
+      <w:pPr>
+        <w:ind w:left="708" w:firstLine="708"/>
+        <w:rPr>
+          <w:sz w:val="24"/>
+          <w:szCs w:val="24"/>
+        </w:rPr>
+      </w:pPr>
+      <w:r>
+        <w:rPr>
+          <w:sz w:val="24"/>
+          <w:szCs w:val="24"/>
+        </w:rPr>
+        <w:t>-</w:t>
+      </w:r>
+      <w:r>
+        <w:rPr>
+          <w:sz w:val="24"/>
+          <w:szCs w:val="24"/>
+        </w:rPr>
+        <w:t xml:space="preserve"> </w:t>
+      </w:r>
+      <w:r>
+        <w:rPr>
+          <w:sz w:val="24"/>
+          <w:szCs w:val="24"/>
+        </w:rPr>
+        <w:t>Kommentek frissítése</w:t>
+      </w:r>
+      <w:r>
+        <w:rPr>
+          <w:sz w:val="24"/>
+          <w:szCs w:val="24"/>
+        </w:rPr>
+        <w:tab/>
+      </w:r>
+    </w:p>
+    <w:p>
+      <w:pPr>
+        <w:ind w:left="708"/>
+        <w:rPr>
+          <w:sz w:val="24"/>
+          <w:szCs w:val="24"/>
+          <w:u w:val="single"/>
+        </w:rPr>
+      </w:pPr>
+      <w:r>
+        <w:rPr>
+          <w:sz w:val="24"/>
+          <w:szCs w:val="24"/>
+          <w:u w:val="single"/>
+        </w:rPr>
+        <w:t>Kristóf:</w:t>
+      </w:r>
+    </w:p>
+    <w:p>
+      <w:pPr>
+        <w:ind w:left="708"/>
+        <w:rPr>
+          <w:sz w:val="24"/>
+          <w:szCs w:val="24"/>
+        </w:rPr>
+      </w:pPr>
+      <w:r>
+        <w:rPr>
+          <w:sz w:val="24"/>
+          <w:szCs w:val="24"/>
+        </w:rPr>
+        <w:tab/>
+        <w:t>- Termék konzolra írása</w:t>
+      </w:r>
+    </w:p>
+    <w:p>
+      <w:pPr>
+        <w:ind w:left="708"/>
+        <w:rPr>
+          <w:sz w:val="24"/>
+          <w:szCs w:val="24"/>
+        </w:rPr>
+      </w:pPr>
+      <w:r>
+        <w:rPr>
+          <w:sz w:val="24"/>
+          <w:szCs w:val="24"/>
+        </w:rPr>
+        <w:tab/>
+      </w:r>
+    </w:p>
+    <w:p>
+      <w:pPr>
+        <w:rPr>
+          <w:sz w:val="24"/>
+          <w:szCs w:val="24"/>
+        </w:rPr>
+      </w:pPr>
+      <w:r>
+        <w:rPr>
+          <w:sz w:val="24"/>
+          <w:szCs w:val="24"/>
+        </w:rPr>
+        <w:t>2026.04.15</w:t>
+      </w:r>
+      <w:r>
+        <w:rPr>
+          <w:sz w:val="24"/>
+          <w:szCs w:val="24"/>
+        </w:rPr>
+        <w:tab/>
+      </w:r>
+    </w:p>
+    <w:p>
+      <w:pPr>
+        <w:rPr>
+          <w:b/>
+          <w:sz w:val="24"/>
+          <w:szCs w:val="24"/>
+        </w:rPr>
+      </w:pPr>
+      <w:r>
+        <w:rPr>
+          <w:b/>
+          <w:sz w:val="24"/>
+          <w:szCs w:val="24"/>
+        </w:rPr>
+        <w:t>Feladatok:</w:t>
+      </w:r>
+    </w:p>
+    <w:p>
+      <w:pPr>
+        <w:ind w:firstLine="708"/>
+        <w:rPr>
+          <w:sz w:val="24"/>
+          <w:szCs w:val="24"/>
+        </w:rPr>
+      </w:pPr>
+      <w:r>
+        <w:rPr>
+          <w:sz w:val="24"/>
+          <w:szCs w:val="24"/>
+          <w:u w:val="single"/>
+        </w:rPr>
+        <w:t>Hanna</w:t>
+      </w:r>
+      <w:r>
+        <w:rPr>
+          <w:sz w:val="24"/>
+          <w:szCs w:val="24"/>
+        </w:rPr>
+        <w:t>:</w:t>
+      </w:r>
+    </w:p>
+    <w:p>
+      <w:pPr>
+        <w:ind w:left="708" w:firstLine="708"/>
+        <w:rPr>
+          <w:sz w:val="24"/>
+          <w:szCs w:val="24"/>
+          <w:u w:val="single"/>
+        </w:rPr>
+      </w:pPr>
       <w:bookmarkStart w:id="0" w:name="_GoBack"/>
       <w:bookmarkEnd w:id="0"/>
-    </w:p>
-    <w:p>
-      <w:pPr>
-        <w:rPr>
-          <w:sz w:val="24"/>
-          <w:szCs w:val="24"/>
-        </w:rPr>
-      </w:pPr>
-      <w:r>
-        <w:rPr>
-          <w:sz w:val="24"/>
-          <w:szCs w:val="24"/>
-        </w:rPr>
-        <w:lastRenderedPageBreak/>
-        <w:t>2026.04.14</w:t>
-      </w:r>
-      <w:r>
-        <w:rPr>
-          <w:sz w:val="24"/>
-          <w:szCs w:val="24"/>
-        </w:rPr>
-        <w:tab/>
-      </w:r>
-    </w:p>
-    <w:p>
-      <w:pPr>
-        <w:rPr>
-          <w:b/>
-          <w:sz w:val="24"/>
-          <w:szCs w:val="24"/>
-        </w:rPr>
-      </w:pPr>
-      <w:r>
-        <w:rPr>
-          <w:b/>
-          <w:sz w:val="24"/>
-          <w:szCs w:val="24"/>
-        </w:rPr>
-        <w:t>Feladatok:</w:t>
+      <w:r>
+        <w:rPr>
+          <w:sz w:val="24"/>
+          <w:szCs w:val="24"/>
+        </w:rPr>
+        <w:t>-------szabadnap-------</w:t>
       </w:r>
     </w:p>
     <w:p>
@@ -742,38 +1077,6 @@
           <w:szCs w:val="24"/>
         </w:rPr>
       </w:pPr>
-      <w:r>
-        <w:rPr>
-          <w:sz w:val="24"/>
-          <w:szCs w:val="24"/>
-          <w:u w:val="single"/>
-        </w:rPr>
-        <w:t>Hanna</w:t>
-      </w:r>
-      <w:r>
-        <w:rPr>
-          <w:sz w:val="24"/>
-          <w:szCs w:val="24"/>
-        </w:rPr>
-        <w:t>:</w:t>
-      </w:r>
-    </w:p>
-    <w:p>
-      <w:pPr>
-        <w:ind w:firstLine="708"/>
-        <w:rPr>
-          <w:sz w:val="24"/>
-          <w:szCs w:val="24"/>
-        </w:rPr>
-      </w:pPr>
-      <w:r>
-        <w:rPr>
-          <w:sz w:val="24"/>
-          <w:szCs w:val="24"/>
-        </w:rPr>
-        <w:tab/>
-        <w:t>-Termékek módosítása</w:t>
-      </w:r>
     </w:p>
     <w:p>
       <w:pPr>
@@ -920,6 +1223,43 @@
     </w:p>
     <w:p>
       <w:pPr>
+        <w:ind w:left="708" w:firstLine="708"/>
+        <w:rPr>
+          <w:sz w:val="24"/>
+          <w:szCs w:val="24"/>
+        </w:rPr>
+      </w:pPr>
+      <w:r>
+        <w:rPr>
+          <w:sz w:val="24"/>
+          <w:szCs w:val="24"/>
+        </w:rPr>
+        <w:t>-</w:t>
+      </w:r>
+      <w:r>
+        <w:rPr>
+          <w:sz w:val="24"/>
+          <w:szCs w:val="24"/>
+        </w:rPr>
+        <w:t xml:space="preserve"> </w:t>
+      </w:r>
+      <w:r>
+        <w:rPr>
+          <w:sz w:val="24"/>
+          <w:szCs w:val="24"/>
+        </w:rPr>
+        <w:t>Kommentek frissítése</w:t>
+      </w:r>
+      <w:r>
+        <w:rPr>
+          <w:sz w:val="24"/>
+          <w:szCs w:val="24"/>
+        </w:rPr>
+        <w:tab/>
+      </w:r>
+    </w:p>
+    <w:p>
+      <w:pPr>
         <w:ind w:left="708"/>
         <w:rPr>
           <w:sz w:val="24"/>
@@ -955,52 +1295,18 @@
     </w:p>
     <w:p>
       <w:pPr>
-        <w:ind w:left="708"/>
-        <w:rPr>
-          <w:sz w:val="24"/>
-          <w:szCs w:val="24"/>
-        </w:rPr>
-      </w:pPr>
-      <w:r>
-        <w:rPr>
-          <w:sz w:val="24"/>
-          <w:szCs w:val="24"/>
-        </w:rPr>
-        <w:tab/>
-        <w:t>- Termék konzolra írása</w:t>
-      </w:r>
-    </w:p>
-    <w:p>
-      <w:pPr>
-        <w:ind w:left="708"/>
-        <w:rPr>
-          <w:sz w:val="24"/>
-          <w:szCs w:val="24"/>
-        </w:rPr>
-      </w:pPr>
-      <w:r>
-        <w:rPr>
-          <w:sz w:val="24"/>
-          <w:szCs w:val="24"/>
-        </w:rPr>
-        <w:tab/>
-        <w:t>- Kommentek frissítése</w:t>
-      </w:r>
-      <w:r>
-        <w:rPr>
-          <w:sz w:val="24"/>
-          <w:szCs w:val="24"/>
-        </w:rPr>
-        <w:tab/>
-      </w:r>
-    </w:p>
-    <w:p>
-      <w:pPr>
-        <w:rPr>
-          <w:sz w:val="24"/>
-          <w:szCs w:val="24"/>
-        </w:rPr>
-      </w:pPr>
+        <w:rPr>
+          <w:sz w:val="24"/>
+          <w:szCs w:val="24"/>
+        </w:rPr>
+      </w:pPr>
+      <w:r>
+        <w:rPr>
+          <w:sz w:val="24"/>
+          <w:szCs w:val="24"/>
+        </w:rPr>
+        <w:tab/>
+      </w:r>
     </w:p>
     <w:sectPr>
       <w:pgSz w:w="11906" w:h="16838"/>
@@ -1643,6 +1949,7 @@
   <w:style w:type="paragraph" w:default="1" w:styleId="Norml">
     <w:name w:val="Normal"/>
     <w:qFormat/>
+    <w:rsid w:val="00881DEA"/>
   </w:style>
   <w:style w:type="character" w:default="1" w:styleId="Bekezdsalapbettpusa">
     <w:name w:val="Default Paragraph Font"/>

</xml_diff>